<commit_message>
ajout de deux experiences H
</commit_message>
<xml_diff>
--- a/rapport.docx
+++ b/rapport.docx
@@ -14,21 +14,7 @@
         <w:rPr>
           <w:lang w:val="fr-FR"/>
         </w:rPr>
-        <w:t xml:space="preserve">Rapport TP - Plateforme d'évaluation loi de </w:t>
-      </w:r>
-      <w:proofErr w:type="spellStart"/>
-      <w:r>
-        <w:rPr>
-          <w:lang w:val="fr-FR"/>
-        </w:rPr>
-        <w:t>Fitts</w:t>
-      </w:r>
-      <w:proofErr w:type="spellEnd"/>
-      <w:r>
-        <w:rPr>
-          <w:lang w:val="fr-FR"/>
-        </w:rPr>
-        <w:t xml:space="preserve"> et analyse GOMS/</w:t>
+        <w:t>Rapport TP - Plateforme d'évaluation loi de Fitts et analyse GOMS/</w:t>
       </w:r>
       <w:proofErr w:type="spellStart"/>
       <w:r>
@@ -61,19 +47,7 @@
           <w:rPr>
             <w:rStyle w:val="Lienhypertexte"/>
           </w:rPr>
-          <w:t>Introduc</w:t>
-        </w:r>
-        <w:r>
-          <w:rPr>
-            <w:rStyle w:val="Lienhypertexte"/>
-          </w:rPr>
-          <w:t>t</w:t>
-        </w:r>
-        <w:r>
-          <w:rPr>
-            <w:rStyle w:val="Lienhypertexte"/>
-          </w:rPr>
-          <w:t>ion</w:t>
+          <w:t>Introduction</w:t>
         </w:r>
       </w:hyperlink>
     </w:p>
@@ -186,6 +160,7 @@
           <w:ilvl w:val="1"/>
           <w:numId w:val="4"/>
         </w:numPr>
+        <w:jc w:val="both"/>
       </w:pPr>
       <w:hyperlink w:anchor="structure-du-projet">
         <w:r>
@@ -230,17 +205,8 @@
             <w:rStyle w:val="Lienhypertexte"/>
             <w:lang w:val="fr-FR"/>
           </w:rPr>
-          <w:t xml:space="preserve">Implémentation de la plateforme loi de </w:t>
+          <w:t>Implémentation de la plateforme loi de Fitts</w:t>
         </w:r>
-        <w:proofErr w:type="spellStart"/>
-        <w:r>
-          <w:rPr>
-            <w:rStyle w:val="Lienhypertexte"/>
-            <w:lang w:val="fr-FR"/>
-          </w:rPr>
-          <w:t>Fitts</w:t>
-        </w:r>
-        <w:proofErr w:type="spellEnd"/>
       </w:hyperlink>
     </w:p>
     <w:p>
@@ -535,29 +501,16 @@
     <w:p>
       <w:pPr>
         <w:pStyle w:val="FirstParagraph"/>
-        <w:rPr>
-          <w:lang w:val="fr-FR"/>
-        </w:rPr>
-      </w:pPr>
-      <w:r>
-        <w:rPr>
-          <w:lang w:val="fr-FR"/>
-        </w:rPr>
-        <w:t xml:space="preserve">Dans le cadre du module HM40 de l'UTBM, il nous a été demandé de développer une plateforme d'évaluation permettant d'expérimenter la loi de </w:t>
-      </w:r>
-      <w:proofErr w:type="spellStart"/>
-      <w:r>
-        <w:rPr>
-          <w:lang w:val="fr-FR"/>
-        </w:rPr>
-        <w:t>Fitts</w:t>
-      </w:r>
-      <w:proofErr w:type="spellEnd"/>
-      <w:r>
-        <w:rPr>
-          <w:lang w:val="fr-FR"/>
-        </w:rPr>
-        <w:t xml:space="preserve"> et l'analyse GOMS/</w:t>
+        <w:jc w:val="both"/>
+        <w:rPr>
+          <w:lang w:val="fr-FR"/>
+        </w:rPr>
+      </w:pPr>
+      <w:r>
+        <w:rPr>
+          <w:lang w:val="fr-FR"/>
+        </w:rPr>
+        <w:t>Dans le cadre du module HM40 de l'UTBM, il nous a été demandé de développer une plateforme d'évaluation permettant d'expérimenter la loi de Fitts et l'analyse GOMS/</w:t>
       </w:r>
       <w:proofErr w:type="spellStart"/>
       <w:r>
@@ -571,21 +524,60 @@
         <w:rPr>
           <w:lang w:val="fr-FR"/>
         </w:rPr>
-        <w:t>. Contrairement aux exigences initiales qui stipulaient l'utilisation de C++ avec la bibliothèque Qt, j'ai obtenu l'autorisation d'utiliser Python avec PySide6, un port de Qt pour Python.</w:t>
+        <w:t>.</w:t>
+      </w:r>
+      <w:r>
+        <w:rPr>
+          <w:lang w:val="fr-FR"/>
+        </w:rPr>
+        <w:t xml:space="preserve"> Etant donné la possibilité d’utiliser soit C</w:t>
+      </w:r>
+      <w:r>
+        <w:rPr>
+          <w:lang w:val="fr-FR"/>
+        </w:rPr>
+        <w:t xml:space="preserve">++ ou python </w:t>
+      </w:r>
+      <w:proofErr w:type="spellStart"/>
+      <w:r>
+        <w:rPr>
+          <w:lang w:val="fr-FR"/>
+        </w:rPr>
+        <w:t>pourle</w:t>
+      </w:r>
+      <w:proofErr w:type="spellEnd"/>
+      <w:r>
+        <w:rPr>
+          <w:lang w:val="fr-FR"/>
+        </w:rPr>
+        <w:t xml:space="preserve"> </w:t>
+      </w:r>
+      <w:r>
+        <w:rPr>
+          <w:lang w:val="fr-FR"/>
+        </w:rPr>
+        <w:t>projet, nous avons choisi d’utiliser python pour ce projet</w:t>
+      </w:r>
+      <w:r>
+        <w:rPr>
+          <w:lang w:val="fr-FR"/>
+        </w:rPr>
+        <w:t>.</w:t>
       </w:r>
     </w:p>
     <w:p>
       <w:pPr>
         <w:pStyle w:val="Corpsdetexte"/>
-        <w:rPr>
-          <w:lang w:val="fr-FR"/>
-        </w:rPr>
-      </w:pPr>
-      <w:r>
-        <w:rPr>
-          <w:lang w:val="fr-FR"/>
-        </w:rPr>
-        <w:t>Ce rapport détaille l'implémentation réalisée, les choix techniques, les difficultés rencontrées, ainsi que les différences entre l'utilisation de Qt en C++ et PySide6 en Python. N'ayant pas de base de code préexistante, j'ai dû développer l'ensemble de l'application depuis le début, ce qui explique que certaines fonctionnalités n'ont pas pu être implémentées dans le temps imparti.</w:t>
+        <w:jc w:val="both"/>
+        <w:rPr>
+          <w:lang w:val="fr-FR"/>
+        </w:rPr>
+      </w:pPr>
+      <w:r>
+        <w:rPr>
+          <w:lang w:val="fr-FR"/>
+        </w:rPr>
+        <w:t xml:space="preserve">Ce rapport détaille l'implémentation réalisée, les choix techniques, les difficultés rencontrées, ainsi que les différences entre l'utilisation de Qt en C++ et PySide6 en Python. </w:t>
       </w:r>
     </w:p>
     <w:p>
@@ -630,12 +622,27 @@
     <w:p>
       <w:pPr>
         <w:pStyle w:val="FirstParagraph"/>
-      </w:pPr>
-      <w:r>
-        <w:rPr>
-          <w:lang w:val="fr-FR"/>
-        </w:rPr>
-        <w:t xml:space="preserve">Pour ce projet, j'ai utilisé Python 3.9 et l'IDE </w:t>
+        <w:rPr>
+          <w:lang w:val="fr-FR"/>
+        </w:rPr>
+      </w:pPr>
+      <w:r>
+        <w:rPr>
+          <w:lang w:val="fr-FR"/>
+        </w:rPr>
+        <w:t xml:space="preserve">Pour ce projet, </w:t>
+      </w:r>
+      <w:r>
+        <w:rPr>
+          <w:lang w:val="fr-FR"/>
+        </w:rPr>
+        <w:t>nous</w:t>
+      </w:r>
+      <w:r>
+        <w:rPr>
+          <w:lang w:val="fr-FR"/>
+        </w:rPr>
+        <w:t xml:space="preserve"> utilisé Python 3.9 et l'IDE </w:t>
       </w:r>
       <w:proofErr w:type="spellStart"/>
       <w:r>
@@ -665,31 +672,25 @@
         </w:rPr>
         <w:t xml:space="preserve">. </w:t>
       </w:r>
-      <w:proofErr w:type="spellStart"/>
-      <w:r>
-        <w:t>Voici</w:t>
-      </w:r>
-      <w:proofErr w:type="spellEnd"/>
-      <w:r>
-        <w:t xml:space="preserve"> les étapes </w:t>
-      </w:r>
-      <w:proofErr w:type="spellStart"/>
-      <w:r>
-        <w:t>d'installation</w:t>
-      </w:r>
-      <w:proofErr w:type="spellEnd"/>
-      <w:r>
-        <w:t xml:space="preserve"> :</w:t>
+      <w:r>
+        <w:rPr>
+          <w:lang w:val="fr-FR"/>
+        </w:rPr>
+        <w:t>Voici les étapes d'installation :</w:t>
       </w:r>
     </w:p>
     <w:p>
       <w:pPr>
         <w:pStyle w:val="Corpsdetexte"/>
+        <w:rPr>
+          <w:lang w:val="fr-FR"/>
+        </w:rPr>
       </w:pPr>
       <w:r>
         <w:rPr>
           <w:b/>
           <w:bCs/>
+          <w:lang w:val="fr-FR"/>
         </w:rPr>
         <w:t>Installation de Python :</w:t>
       </w:r>
@@ -781,15 +782,13 @@
         </w:rPr>
         <w:t xml:space="preserve">Installation de </w:t>
       </w:r>
-      <w:proofErr w:type="gramStart"/>
       <w:r>
         <w:rPr>
           <w:b/>
           <w:bCs/>
         </w:rPr>
-        <w:t>PyCharm :</w:t>
-      </w:r>
-      <w:proofErr w:type="gramEnd"/>
+        <w:t>PyCharm:</w:t>
+      </w:r>
     </w:p>
     <w:p>
       <w:pPr>
@@ -971,7 +970,19 @@
         <w:rPr>
           <w:lang w:val="fr-FR"/>
         </w:rPr>
-        <w:t xml:space="preserve">Lors de la création du projet, j'ai sélectionné "New </w:t>
+        <w:t xml:space="preserve">Lors de la création du projet, </w:t>
+      </w:r>
+      <w:r>
+        <w:rPr>
+          <w:lang w:val="fr-FR"/>
+        </w:rPr>
+        <w:t>nous avons</w:t>
+      </w:r>
+      <w:r>
+        <w:rPr>
+          <w:lang w:val="fr-FR"/>
+        </w:rPr>
+        <w:t xml:space="preserve"> sélectionné "New </w:t>
       </w:r>
       <w:proofErr w:type="spellStart"/>
       <w:r>
@@ -1123,99 +1134,99 @@
           <w:rStyle w:val="CommentTok"/>
           <w:lang w:val="fr-FR"/>
         </w:rPr>
+        <w:t># Création de l'environnement virtuel</w:t>
+      </w:r>
+      <w:r>
+        <w:rPr>
+          <w:lang w:val="fr-FR"/>
+        </w:rPr>
+        <w:br/>
+      </w:r>
+      <w:r>
+        <w:rPr>
+          <w:rStyle w:val="ExtensionTok"/>
+          <w:lang w:val="fr-FR"/>
+        </w:rPr>
+        <w:t>python</w:t>
+      </w:r>
+      <w:r>
+        <w:rPr>
+          <w:rStyle w:val="NormalTok"/>
+          <w:lang w:val="fr-FR"/>
+        </w:rPr>
+        <w:t xml:space="preserve"> </w:t>
+      </w:r>
+      <w:r>
+        <w:rPr>
+          <w:rStyle w:val="AttributeTok"/>
+          <w:lang w:val="fr-FR"/>
+        </w:rPr>
+        <w:t>-m</w:t>
+      </w:r>
+      <w:r>
+        <w:rPr>
+          <w:rStyle w:val="NormalTok"/>
+          <w:lang w:val="fr-FR"/>
+        </w:rPr>
+        <w:t xml:space="preserve"> </w:t>
+      </w:r>
+      <w:proofErr w:type="spellStart"/>
+      <w:r>
+        <w:rPr>
+          <w:rStyle w:val="NormalTok"/>
+          <w:lang w:val="fr-FR"/>
+        </w:rPr>
+        <w:t>venv</w:t>
+      </w:r>
+      <w:proofErr w:type="spellEnd"/>
+      <w:r>
+        <w:rPr>
+          <w:rStyle w:val="NormalTok"/>
+          <w:lang w:val="fr-FR"/>
+        </w:rPr>
+        <w:t xml:space="preserve"> </w:t>
+      </w:r>
+      <w:proofErr w:type="spellStart"/>
+      <w:r>
+        <w:rPr>
+          <w:rStyle w:val="NormalTok"/>
+          <w:lang w:val="fr-FR"/>
+        </w:rPr>
+        <w:t>venv</w:t>
+      </w:r>
+      <w:proofErr w:type="spellEnd"/>
+      <w:r>
+        <w:rPr>
+          <w:lang w:val="fr-FR"/>
+        </w:rPr>
+        <w:br/>
+      </w:r>
+      <w:r>
+        <w:rPr>
+          <w:lang w:val="fr-FR"/>
+        </w:rPr>
+        <w:br/>
+      </w:r>
+      <w:r>
+        <w:rPr>
+          <w:rStyle w:val="CommentTok"/>
+          <w:lang w:val="fr-FR"/>
+        </w:rPr>
+        <w:t># Activation sur Windows</w:t>
+      </w:r>
+      <w:r>
+        <w:rPr>
+          <w:lang w:val="fr-FR"/>
+        </w:rPr>
+        <w:br/>
+      </w:r>
+      <w:proofErr w:type="spellStart"/>
+      <w:r>
+        <w:rPr>
+          <w:rStyle w:val="ExtensionTok"/>
+          <w:lang w:val="fr-FR"/>
+        </w:rPr>
         <w:lastRenderedPageBreak/>
-        <w:t># Création de l'environnement virtuel</w:t>
-      </w:r>
-      <w:r>
-        <w:rPr>
-          <w:lang w:val="fr-FR"/>
-        </w:rPr>
-        <w:br/>
-      </w:r>
-      <w:r>
-        <w:rPr>
-          <w:rStyle w:val="ExtensionTok"/>
-          <w:lang w:val="fr-FR"/>
-        </w:rPr>
-        <w:t>python</w:t>
-      </w:r>
-      <w:r>
-        <w:rPr>
-          <w:rStyle w:val="NormalTok"/>
-          <w:lang w:val="fr-FR"/>
-        </w:rPr>
-        <w:t xml:space="preserve"> </w:t>
-      </w:r>
-      <w:r>
-        <w:rPr>
-          <w:rStyle w:val="AttributeTok"/>
-          <w:lang w:val="fr-FR"/>
-        </w:rPr>
-        <w:t>-m</w:t>
-      </w:r>
-      <w:r>
-        <w:rPr>
-          <w:rStyle w:val="NormalTok"/>
-          <w:lang w:val="fr-FR"/>
-        </w:rPr>
-        <w:t xml:space="preserve"> </w:t>
-      </w:r>
-      <w:proofErr w:type="spellStart"/>
-      <w:r>
-        <w:rPr>
-          <w:rStyle w:val="NormalTok"/>
-          <w:lang w:val="fr-FR"/>
-        </w:rPr>
-        <w:t>venv</w:t>
-      </w:r>
-      <w:proofErr w:type="spellEnd"/>
-      <w:r>
-        <w:rPr>
-          <w:rStyle w:val="NormalTok"/>
-          <w:lang w:val="fr-FR"/>
-        </w:rPr>
-        <w:t xml:space="preserve"> </w:t>
-      </w:r>
-      <w:proofErr w:type="spellStart"/>
-      <w:r>
-        <w:rPr>
-          <w:rStyle w:val="NormalTok"/>
-          <w:lang w:val="fr-FR"/>
-        </w:rPr>
-        <w:t>venv</w:t>
-      </w:r>
-      <w:proofErr w:type="spellEnd"/>
-      <w:r>
-        <w:rPr>
-          <w:lang w:val="fr-FR"/>
-        </w:rPr>
-        <w:br/>
-      </w:r>
-      <w:r>
-        <w:rPr>
-          <w:lang w:val="fr-FR"/>
-        </w:rPr>
-        <w:br/>
-      </w:r>
-      <w:r>
-        <w:rPr>
-          <w:rStyle w:val="CommentTok"/>
-          <w:lang w:val="fr-FR"/>
-        </w:rPr>
-        <w:t># Activation sur Windows</w:t>
-      </w:r>
-      <w:r>
-        <w:rPr>
-          <w:lang w:val="fr-FR"/>
-        </w:rPr>
-        <w:br/>
-      </w:r>
-      <w:proofErr w:type="spellStart"/>
-      <w:r>
-        <w:rPr>
-          <w:rStyle w:val="ExtensionTok"/>
-          <w:lang w:val="fr-FR"/>
-        </w:rPr>
         <w:t>venv</w:t>
       </w:r>
       <w:proofErr w:type="spellEnd"/>
@@ -1343,21 +1354,7 @@
         <w:rPr>
           <w:lang w:val="fr-FR"/>
         </w:rPr>
-        <w:t xml:space="preserve">PySide6 est le binding officiel de Qt pour Python maintenu par The Qt </w:t>
-      </w:r>
-      <w:proofErr w:type="spellStart"/>
-      <w:r>
-        <w:rPr>
-          <w:lang w:val="fr-FR"/>
-        </w:rPr>
-        <w:t>Company</w:t>
-      </w:r>
-      <w:proofErr w:type="spellEnd"/>
-      <w:r>
-        <w:rPr>
-          <w:lang w:val="fr-FR"/>
-        </w:rPr>
-        <w:t xml:space="preserve">. Il s'agit d'une alternative à </w:t>
+        <w:t xml:space="preserve">PySide6 est le binding officiel de Qt pour Python maintenu par The Qt Company. Il s'agit d'une alternative à </w:t>
       </w:r>
       <w:proofErr w:type="spellStart"/>
       <w:r>
@@ -1381,11 +1378,9 @@
       <w:r>
         <w:t xml:space="preserve">Installation via </w:t>
       </w:r>
-      <w:proofErr w:type="gramStart"/>
-      <w:r>
-        <w:t>PyCharm :</w:t>
-      </w:r>
-      <w:proofErr w:type="gramEnd"/>
+      <w:r>
+        <w:t>PyCharm:</w:t>
+      </w:r>
     </w:p>
     <w:p>
       <w:pPr>
@@ -1520,7 +1515,13 @@
         <w:rPr>
           <w:lang w:val="fr-FR"/>
         </w:rPr>
-        <w:t>J'ai également installé les dépendances suivantes pour les graphiques statistiques :</w:t>
+        <w:t>Nous avons</w:t>
+      </w:r>
+      <w:r>
+        <w:rPr>
+          <w:lang w:val="fr-FR"/>
+        </w:rPr>
+        <w:t xml:space="preserve"> également installé les dépendances suivantes pour les graphiques statistiques :</w:t>
       </w:r>
     </w:p>
     <w:p>
@@ -1609,6 +1610,7 @@
     <w:p>
       <w:pPr>
         <w:pStyle w:val="FirstParagraph"/>
+        <w:jc w:val="both"/>
         <w:rPr>
           <w:lang w:val="fr-FR"/>
         </w:rPr>
@@ -2265,16 +2267,8 @@
         <w:rPr>
           <w:lang w:val="fr-FR"/>
         </w:rPr>
-        <w:t xml:space="preserve"> : Définit les constantes utilisées dans l'application, notamment les paramètres par défaut pour la loi de </w:t>
-      </w:r>
-      <w:proofErr w:type="spellStart"/>
-      <w:r>
-        <w:rPr>
-          <w:lang w:val="fr-FR"/>
-        </w:rPr>
-        <w:t>Fitts</w:t>
-      </w:r>
-      <w:proofErr w:type="spellEnd"/>
+        <w:t xml:space="preserve"> : Définit les constantes utilisées dans l'application, notamment les paramètres par défaut pour la loi de Fitts</w:t>
+      </w:r>
     </w:p>
     <w:p>
       <w:pPr>
@@ -2323,16 +2317,8 @@
         <w:rPr>
           <w:lang w:val="fr-FR"/>
         </w:rPr>
-        <w:t xml:space="preserve"> : Écran pour l'expérience de </w:t>
-      </w:r>
-      <w:proofErr w:type="spellStart"/>
-      <w:r>
-        <w:rPr>
-          <w:lang w:val="fr-FR"/>
-        </w:rPr>
-        <w:t>Fitts</w:t>
-      </w:r>
-      <w:proofErr w:type="spellEnd"/>
+        <w:t xml:space="preserve"> : Écran pour l'expérience de Fitts</w:t>
+      </w:r>
     </w:p>
     <w:p>
       <w:pPr>
@@ -2356,16 +2342,8 @@
         <w:rPr>
           <w:lang w:val="fr-FR"/>
         </w:rPr>
-        <w:t xml:space="preserve"> : Widget pour l'affichage et la manipulation des cibles dans l'expérience de </w:t>
-      </w:r>
-      <w:proofErr w:type="spellStart"/>
-      <w:r>
-        <w:rPr>
-          <w:lang w:val="fr-FR"/>
-        </w:rPr>
-        <w:t>Fitts</w:t>
-      </w:r>
-      <w:proofErr w:type="spellEnd"/>
+        <w:t xml:space="preserve"> : Widget pour l'affichage et la manipulation des cibles dans l'expérience de Fitts</w:t>
+      </w:r>
     </w:p>
     <w:p>
       <w:pPr>
@@ -2461,56 +2439,6 @@
           <w:lang w:val="fr-FR"/>
         </w:rPr>
       </w:pPr>
-      <w:r>
-        <w:rPr>
-          <w:rStyle w:val="VerbatimChar"/>
-          <w:lang w:val="fr-FR"/>
-        </w:rPr>
-        <w:t>cognitive_load_experiment.py</w:t>
-      </w:r>
-      <w:r>
-        <w:rPr>
-          <w:lang w:val="fr-FR"/>
-        </w:rPr>
-        <w:t xml:space="preserve"> : Expérience sur l'impact de la charge cognitive sur la performance de frappe</w:t>
-      </w:r>
-    </w:p>
-    <w:p>
-      <w:pPr>
-        <w:pStyle w:val="Compact"/>
-        <w:numPr>
-          <w:ilvl w:val="0"/>
-          <w:numId w:val="14"/>
-        </w:numPr>
-        <w:rPr>
-          <w:lang w:val="fr-FR"/>
-        </w:rPr>
-      </w:pPr>
-      <w:r>
-        <w:rPr>
-          <w:rStyle w:val="VerbatimChar"/>
-          <w:lang w:val="fr-FR"/>
-        </w:rPr>
-        <w:t>navigation_experiment.py</w:t>
-      </w:r>
-      <w:r>
-        <w:rPr>
-          <w:lang w:val="fr-FR"/>
-        </w:rPr>
-        <w:t xml:space="preserve"> : Expérience comparant l'efficacité de navigation entre clavier et souris</w:t>
-      </w:r>
-    </w:p>
-    <w:p>
-      <w:pPr>
-        <w:pStyle w:val="Compact"/>
-        <w:numPr>
-          <w:ilvl w:val="0"/>
-          <w:numId w:val="14"/>
-        </w:numPr>
-        <w:rPr>
-          <w:lang w:val="fr-FR"/>
-        </w:rPr>
-      </w:pPr>
       <w:proofErr w:type="spellStart"/>
       <w:r>
         <w:rPr>
@@ -2800,6 +2728,7 @@
     <w:p>
       <w:pPr>
         <w:pStyle w:val="FirstParagraph"/>
+        <w:jc w:val="both"/>
       </w:pPr>
       <w:r>
         <w:t>Cette approche présente plusieurs avantages :</w:t>
@@ -2812,6 +2741,7 @@
           <w:ilvl w:val="0"/>
           <w:numId w:val="15"/>
         </w:numPr>
+        <w:jc w:val="both"/>
         <w:rPr>
           <w:lang w:val="fr-FR"/>
         </w:rPr>
@@ -2830,6 +2760,7 @@
           <w:ilvl w:val="0"/>
           <w:numId w:val="15"/>
         </w:numPr>
+        <w:jc w:val="both"/>
         <w:rPr>
           <w:lang w:val="fr-FR"/>
         </w:rPr>
@@ -2848,6 +2779,7 @@
           <w:ilvl w:val="0"/>
           <w:numId w:val="15"/>
         </w:numPr>
+        <w:jc w:val="both"/>
         <w:rPr>
           <w:lang w:val="fr-FR"/>
         </w:rPr>
@@ -2873,16 +2805,8 @@
         <w:rPr>
           <w:lang w:val="fr-FR"/>
         </w:rPr>
-        <w:t xml:space="preserve">Implémentation de la plateforme loi de </w:t>
-      </w:r>
-      <w:proofErr w:type="spellStart"/>
-      <w:r>
-        <w:rPr>
-          <w:lang w:val="fr-FR"/>
-        </w:rPr>
-        <w:t>Fitts</w:t>
-      </w:r>
-      <w:proofErr w:type="spellEnd"/>
+        <w:t>Implémentation de la plateforme loi de Fitts</w:t>
+      </w:r>
     </w:p>
     <w:p>
       <w:pPr>
@@ -2902,48 +2826,22 @@
     <w:p>
       <w:pPr>
         <w:pStyle w:val="FirstParagraph"/>
-        <w:rPr>
-          <w:lang w:val="fr-FR"/>
-        </w:rPr>
-      </w:pPr>
-      <w:r>
-        <w:rPr>
-          <w:lang w:val="fr-FR"/>
-        </w:rPr>
-        <w:t xml:space="preserve">La loi de </w:t>
-      </w:r>
-      <w:proofErr w:type="spellStart"/>
-      <w:r>
-        <w:rPr>
-          <w:lang w:val="fr-FR"/>
-        </w:rPr>
-        <w:t>Fitts</w:t>
-      </w:r>
-      <w:proofErr w:type="spellEnd"/>
-      <w:r>
-        <w:rPr>
-          <w:lang w:val="fr-FR"/>
-        </w:rPr>
-        <w:t xml:space="preserve">, formulée par Paul </w:t>
-      </w:r>
-      <w:proofErr w:type="spellStart"/>
-      <w:r>
-        <w:rPr>
-          <w:lang w:val="fr-FR"/>
-        </w:rPr>
-        <w:t>Fitts</w:t>
-      </w:r>
-      <w:proofErr w:type="spellEnd"/>
-      <w:r>
-        <w:rPr>
-          <w:lang w:val="fr-FR"/>
-        </w:rPr>
-        <w:t xml:space="preserve"> en 1954, modélise le temps nécessaire pour atteindre une cible en fonction de la distance à parcourir et de la taille de la cible. La formule utilisée est :</w:t>
+        <w:jc w:val="both"/>
+        <w:rPr>
+          <w:lang w:val="fr-FR"/>
+        </w:rPr>
+      </w:pPr>
+      <w:r>
+        <w:rPr>
+          <w:lang w:val="fr-FR"/>
+        </w:rPr>
+        <w:t>La loi de Fitts, formulée par Paul Fitts en 1954, modélise le temps nécessaire pour atteindre une cible en fonction de la distance à parcourir et de la taille de la cible. La formule utilisée est :</w:t>
       </w:r>
     </w:p>
     <w:p>
       <w:pPr>
         <w:pStyle w:val="Corpsdetexte"/>
+        <w:jc w:val="both"/>
         <w:rPr>
           <w:lang w:val="fr-FR"/>
         </w:rPr>
@@ -2958,6 +2856,7 @@
     <w:p>
       <w:pPr>
         <w:pStyle w:val="Corpsdetexte"/>
+        <w:jc w:val="both"/>
       </w:pPr>
       <w:proofErr w:type="spellStart"/>
       <w:proofErr w:type="gramStart"/>
@@ -2977,6 +2876,7 @@
           <w:ilvl w:val="0"/>
           <w:numId w:val="16"/>
         </w:numPr>
+        <w:jc w:val="both"/>
         <w:rPr>
           <w:lang w:val="fr-FR"/>
         </w:rPr>
@@ -2995,6 +2895,7 @@
           <w:ilvl w:val="0"/>
           <w:numId w:val="16"/>
         </w:numPr>
+        <w:jc w:val="both"/>
         <w:rPr>
           <w:lang w:val="fr-FR"/>
         </w:rPr>
@@ -3013,6 +2914,7 @@
           <w:ilvl w:val="0"/>
           <w:numId w:val="16"/>
         </w:numPr>
+        <w:jc w:val="both"/>
         <w:rPr>
           <w:lang w:val="fr-FR"/>
         </w:rPr>
@@ -3031,6 +2933,7 @@
           <w:ilvl w:val="0"/>
           <w:numId w:val="16"/>
         </w:numPr>
+        <w:jc w:val="both"/>
         <w:rPr>
           <w:lang w:val="fr-FR"/>
         </w:rPr>
@@ -3053,29 +2956,16 @@
     <w:p>
       <w:pPr>
         <w:pStyle w:val="FirstParagraph"/>
-        <w:rPr>
-          <w:lang w:val="fr-FR"/>
-        </w:rPr>
-      </w:pPr>
-      <w:r>
-        <w:rPr>
-          <w:lang w:val="fr-FR"/>
-        </w:rPr>
-        <w:t xml:space="preserve">L'expérience implémentée consiste à générer des cibles de taille aléatoire à différentes positions, et à mesurer le temps que met l'utilisateur pour les atteindre avec la souris. Ces mesures sont ensuite comparées aux prédictions théoriques de la loi de </w:t>
-      </w:r>
-      <w:proofErr w:type="spellStart"/>
-      <w:r>
-        <w:rPr>
-          <w:lang w:val="fr-FR"/>
-        </w:rPr>
-        <w:t>Fitts</w:t>
-      </w:r>
-      <w:proofErr w:type="spellEnd"/>
-      <w:r>
-        <w:rPr>
-          <w:lang w:val="fr-FR"/>
-        </w:rPr>
-        <w:t>.</w:t>
+        <w:jc w:val="both"/>
+        <w:rPr>
+          <w:lang w:val="fr-FR"/>
+        </w:rPr>
+      </w:pPr>
+      <w:r>
+        <w:rPr>
+          <w:lang w:val="fr-FR"/>
+        </w:rPr>
+        <w:t>L'expérience implémentée consiste à générer des cibles de taille aléatoire à différentes positions, et à mesurer le temps que met l'utilisateur pour les atteindre avec la souris. Ces mesures sont ensuite comparées aux prédictions théoriques de la loi de Fitts.</w:t>
       </w:r>
     </w:p>
     <w:p>
@@ -3099,595 +2989,15 @@
     </w:p>
     <w:p>
       <w:pPr>
-        <w:pStyle w:val="Titre3"/>
-        <w:rPr>
-          <w:lang w:val="fr-FR"/>
-        </w:rPr>
-      </w:pPr>
-      <w:r>
-        <w:rPr>
-          <w:lang w:val="fr-FR"/>
-        </w:rPr>
-        <w:lastRenderedPageBreak/>
-        <w:t>Interface utilisateur</w:t>
-      </w:r>
-    </w:p>
-    <w:p>
-      <w:pPr>
-        <w:pStyle w:val="FirstParagraph"/>
-        <w:rPr>
-          <w:lang w:val="fr-FR"/>
-        </w:rPr>
-      </w:pPr>
-      <w:r>
-        <w:rPr>
-          <w:lang w:val="fr-FR"/>
-        </w:rPr>
-        <w:t xml:space="preserve">L'interface de l'expérience de </w:t>
-      </w:r>
-      <w:proofErr w:type="spellStart"/>
-      <w:r>
-        <w:rPr>
-          <w:lang w:val="fr-FR"/>
-        </w:rPr>
-        <w:t>Fitts</w:t>
-      </w:r>
-      <w:proofErr w:type="spellEnd"/>
-      <w:r>
-        <w:rPr>
-          <w:lang w:val="fr-FR"/>
-        </w:rPr>
-        <w:t xml:space="preserve"> comprend :</w:t>
-      </w:r>
-    </w:p>
-    <w:p>
-      <w:pPr>
-        <w:pStyle w:val="Compact"/>
-        <w:numPr>
-          <w:ilvl w:val="0"/>
-          <w:numId w:val="17"/>
-        </w:numPr>
-        <w:rPr>
-          <w:lang w:val="fr-FR"/>
-        </w:rPr>
-      </w:pPr>
-      <w:r>
-        <w:rPr>
-          <w:lang w:val="fr-FR"/>
-        </w:rPr>
-        <w:t>Un bouton "Start" pour démarrer l'expérience</w:t>
-      </w:r>
-    </w:p>
-    <w:p>
-      <w:pPr>
-        <w:pStyle w:val="Compact"/>
-        <w:numPr>
-          <w:ilvl w:val="0"/>
-          <w:numId w:val="17"/>
-        </w:numPr>
-        <w:rPr>
-          <w:lang w:val="fr-FR"/>
-        </w:rPr>
-      </w:pPr>
-      <w:r>
-        <w:rPr>
-          <w:lang w:val="fr-FR"/>
-        </w:rPr>
-        <w:t>Une zone d'expérimentation où les cibles apparaissent</w:t>
-      </w:r>
-    </w:p>
-    <w:p>
-      <w:pPr>
-        <w:pStyle w:val="Compact"/>
-        <w:numPr>
-          <w:ilvl w:val="0"/>
-          <w:numId w:val="17"/>
-        </w:numPr>
-      </w:pPr>
-      <w:r>
-        <w:t xml:space="preserve">Des instructions </w:t>
-      </w:r>
-      <w:proofErr w:type="spellStart"/>
-      <w:r>
-        <w:t>claires</w:t>
-      </w:r>
-      <w:proofErr w:type="spellEnd"/>
-      <w:r>
-        <w:t xml:space="preserve"> pour l'utilisateur</w:t>
-      </w:r>
-    </w:p>
-    <w:p>
-      <w:pPr>
-        <w:pStyle w:val="FirstParagraph"/>
-        <w:rPr>
-          <w:lang w:val="fr-FR"/>
-        </w:rPr>
-      </w:pPr>
-      <w:r>
-        <w:rPr>
-          <w:lang w:val="fr-FR"/>
-        </w:rPr>
-        <w:t xml:space="preserve">La classe </w:t>
-      </w:r>
-      <w:proofErr w:type="spellStart"/>
-      <w:r>
-        <w:rPr>
-          <w:rStyle w:val="VerbatimChar"/>
-          <w:lang w:val="fr-FR"/>
-        </w:rPr>
-        <w:t>FittsExperimentScreen</w:t>
-      </w:r>
-      <w:proofErr w:type="spellEnd"/>
-      <w:r>
-        <w:rPr>
-          <w:lang w:val="fr-FR"/>
-        </w:rPr>
-        <w:t xml:space="preserve"> gère l'interface utilisateur, tandis que la classe </w:t>
-      </w:r>
-      <w:proofErr w:type="spellStart"/>
-      <w:r>
-        <w:rPr>
-          <w:rStyle w:val="VerbatimChar"/>
-          <w:lang w:val="fr-FR"/>
-        </w:rPr>
-        <w:t>ExperimentArea</w:t>
-      </w:r>
-      <w:proofErr w:type="spellEnd"/>
-      <w:r>
-        <w:rPr>
-          <w:lang w:val="fr-FR"/>
-        </w:rPr>
-        <w:t xml:space="preserve"> s'occupe de l'affichage et de la gestion des cibles.</w:t>
-      </w:r>
-    </w:p>
-    <w:p>
-      <w:pPr>
-        <w:pStyle w:val="SourceCode"/>
-      </w:pPr>
-      <w:r>
-        <w:rPr>
-          <w:rStyle w:val="KeywordTok"/>
-        </w:rPr>
-        <w:t>def</w:t>
-      </w:r>
-      <w:r>
-        <w:rPr>
-          <w:rStyle w:val="NormalTok"/>
-        </w:rPr>
-        <w:t xml:space="preserve"> _</w:t>
-      </w:r>
-      <w:proofErr w:type="spellStart"/>
-      <w:r>
-        <w:rPr>
-          <w:rStyle w:val="NormalTok"/>
-        </w:rPr>
-        <w:t>init_ui</w:t>
-      </w:r>
-      <w:proofErr w:type="spellEnd"/>
-      <w:r>
-        <w:rPr>
-          <w:rStyle w:val="NormalTok"/>
-        </w:rPr>
-        <w:t>(</w:t>
-      </w:r>
-      <w:r>
-        <w:rPr>
-          <w:rStyle w:val="VariableTok"/>
-        </w:rPr>
-        <w:t>self</w:t>
-      </w:r>
-      <w:r>
-        <w:rPr>
-          <w:rStyle w:val="NormalTok"/>
-        </w:rPr>
-        <w:t xml:space="preserve">) </w:t>
-      </w:r>
-      <w:r>
-        <w:rPr>
-          <w:rStyle w:val="OperatorTok"/>
-        </w:rPr>
-        <w:t>-&gt;</w:t>
-      </w:r>
-      <w:r>
-        <w:rPr>
-          <w:rStyle w:val="NormalTok"/>
-        </w:rPr>
-        <w:t xml:space="preserve"> </w:t>
-      </w:r>
-      <w:r>
-        <w:rPr>
-          <w:rStyle w:val="VariableTok"/>
-        </w:rPr>
-        <w:t>None</w:t>
-      </w:r>
-      <w:r>
-        <w:rPr>
-          <w:rStyle w:val="NormalTok"/>
-        </w:rPr>
-        <w:t>:</w:t>
-      </w:r>
-      <w:r>
-        <w:br/>
-      </w:r>
-      <w:r>
-        <w:rPr>
-          <w:rStyle w:val="NormalTok"/>
-        </w:rPr>
-        <w:t xml:space="preserve">    layout </w:t>
-      </w:r>
-      <w:r>
-        <w:rPr>
-          <w:rStyle w:val="OperatorTok"/>
-        </w:rPr>
-        <w:t>=</w:t>
-      </w:r>
-      <w:r>
-        <w:rPr>
-          <w:rStyle w:val="NormalTok"/>
-        </w:rPr>
-        <w:t xml:space="preserve"> QVBoxLayout()</w:t>
-      </w:r>
-      <w:r>
-        <w:br/>
-      </w:r>
-      <w:r>
-        <w:rPr>
-          <w:rStyle w:val="NormalTok"/>
-        </w:rPr>
-        <w:t xml:space="preserve">    instructions </w:t>
-      </w:r>
-      <w:r>
-        <w:rPr>
-          <w:rStyle w:val="OperatorTok"/>
-        </w:rPr>
-        <w:t>=</w:t>
-      </w:r>
-      <w:r>
-        <w:rPr>
-          <w:rStyle w:val="NormalTok"/>
-        </w:rPr>
-        <w:t xml:space="preserve"> QLabel(</w:t>
-      </w:r>
-      <w:r>
-        <w:rPr>
-          <w:rStyle w:val="StringTok"/>
-        </w:rPr>
-        <w:t>"Click Start to begin the Fitts experiment"</w:t>
-      </w:r>
-      <w:r>
-        <w:rPr>
-          <w:rStyle w:val="NormalTok"/>
-        </w:rPr>
-        <w:t>)</w:t>
-      </w:r>
-      <w:r>
-        <w:br/>
-      </w:r>
-      <w:r>
-        <w:rPr>
-          <w:rStyle w:val="NormalTok"/>
-        </w:rPr>
-        <w:t xml:space="preserve">    instructions.setAlignment(Qt.AlignCenter)</w:t>
-      </w:r>
-      <w:r>
-        <w:br/>
-      </w:r>
-      <w:r>
-        <w:rPr>
-          <w:rStyle w:val="NormalTok"/>
-        </w:rPr>
-        <w:t xml:space="preserve">    layout.addWidget(instructions)</w:t>
-      </w:r>
-      <w:r>
-        <w:br/>
-      </w:r>
-      <w:r>
-        <w:br/>
-      </w:r>
-      <w:r>
-        <w:rPr>
-          <w:rStyle w:val="NormalTok"/>
-        </w:rPr>
-        <w:t xml:space="preserve">    button_layout </w:t>
-      </w:r>
-      <w:r>
-        <w:rPr>
-          <w:rStyle w:val="OperatorTok"/>
-        </w:rPr>
-        <w:t>=</w:t>
-      </w:r>
-      <w:r>
-        <w:rPr>
-          <w:rStyle w:val="NormalTok"/>
-        </w:rPr>
-        <w:t xml:space="preserve"> QHBoxLayout()</w:t>
-      </w:r>
-      <w:r>
-        <w:br/>
-      </w:r>
-      <w:r>
-        <w:rPr>
-          <w:rStyle w:val="NormalTok"/>
-        </w:rPr>
-        <w:t xml:space="preserve">    </w:t>
-      </w:r>
-      <w:r>
-        <w:rPr>
-          <w:rStyle w:val="VariableTok"/>
-        </w:rPr>
-        <w:t>self</w:t>
-      </w:r>
-      <w:r>
-        <w:rPr>
-          <w:rStyle w:val="NormalTok"/>
-        </w:rPr>
-        <w:t xml:space="preserve">.start_button </w:t>
-      </w:r>
-      <w:r>
-        <w:rPr>
-          <w:rStyle w:val="OperatorTok"/>
-        </w:rPr>
-        <w:t>=</w:t>
-      </w:r>
-      <w:r>
-        <w:rPr>
-          <w:rStyle w:val="NormalTok"/>
-        </w:rPr>
-        <w:t xml:space="preserve"> QPushButton(</w:t>
-      </w:r>
-      <w:r>
-        <w:rPr>
-          <w:rStyle w:val="StringTok"/>
-        </w:rPr>
-        <w:t>"Start"</w:t>
-      </w:r>
-      <w:r>
-        <w:rPr>
-          <w:rStyle w:val="NormalTok"/>
-        </w:rPr>
-        <w:t>)</w:t>
-      </w:r>
-      <w:r>
-        <w:br/>
-      </w:r>
-      <w:r>
-        <w:rPr>
-          <w:rStyle w:val="NormalTok"/>
-        </w:rPr>
-        <w:t xml:space="preserve">    </w:t>
-      </w:r>
-      <w:r>
-        <w:rPr>
-          <w:rStyle w:val="VariableTok"/>
-        </w:rPr>
-        <w:t>self</w:t>
-      </w:r>
-      <w:r>
-        <w:rPr>
-          <w:rStyle w:val="NormalTok"/>
-        </w:rPr>
-        <w:t>.start_button.clicked.</w:t>
-      </w:r>
-      <w:r>
-        <w:rPr>
-          <w:rStyle w:val="ExtensionTok"/>
-        </w:rPr>
-        <w:t>connect</w:t>
-      </w:r>
-      <w:r>
-        <w:rPr>
-          <w:rStyle w:val="NormalTok"/>
-        </w:rPr>
-        <w:t>(</w:t>
-      </w:r>
-      <w:r>
-        <w:rPr>
-          <w:rStyle w:val="VariableTok"/>
-        </w:rPr>
-        <w:t>self</w:t>
-      </w:r>
-      <w:r>
-        <w:rPr>
-          <w:rStyle w:val="NormalTok"/>
-        </w:rPr>
-        <w:t>.start_experiment)</w:t>
-      </w:r>
-      <w:r>
-        <w:br/>
-      </w:r>
-      <w:r>
-        <w:rPr>
-          <w:rStyle w:val="NormalTok"/>
-        </w:rPr>
-        <w:t xml:space="preserve">    button_layout.addWidget(</w:t>
-      </w:r>
-      <w:r>
-        <w:rPr>
-          <w:rStyle w:val="VariableTok"/>
-        </w:rPr>
-        <w:t>self</w:t>
-      </w:r>
-      <w:r>
-        <w:rPr>
-          <w:rStyle w:val="NormalTok"/>
-        </w:rPr>
-        <w:t>.start_button)</w:t>
-      </w:r>
-      <w:r>
-        <w:br/>
-      </w:r>
-      <w:r>
-        <w:br/>
-      </w:r>
-      <w:r>
-        <w:rPr>
-          <w:rStyle w:val="NormalTok"/>
-        </w:rPr>
-        <w:t xml:space="preserve">    layout.addLayout(button_layout)</w:t>
-      </w:r>
-      <w:r>
-        <w:br/>
-      </w:r>
-      <w:r>
-        <w:br/>
-      </w:r>
-      <w:r>
-        <w:rPr>
-          <w:rStyle w:val="NormalTok"/>
-        </w:rPr>
-        <w:t xml:space="preserve">    </w:t>
-      </w:r>
-      <w:r>
-        <w:rPr>
-          <w:rStyle w:val="ImportTok"/>
-        </w:rPr>
-        <w:t>from</w:t>
-      </w:r>
-      <w:r>
-        <w:rPr>
-          <w:rStyle w:val="NormalTok"/>
-        </w:rPr>
-        <w:t xml:space="preserve"> experiment_area </w:t>
-      </w:r>
-      <w:r>
-        <w:rPr>
-          <w:rStyle w:val="ImportTok"/>
-        </w:rPr>
-        <w:t>import</w:t>
-      </w:r>
-      <w:r>
-        <w:rPr>
-          <w:rStyle w:val="NormalTok"/>
-        </w:rPr>
-        <w:t xml:space="preserve"> ExperimentArea</w:t>
-      </w:r>
-      <w:r>
-        <w:br/>
-      </w:r>
-      <w:r>
-        <w:rPr>
-          <w:rStyle w:val="NormalTok"/>
-        </w:rPr>
-        <w:t xml:space="preserve">    </w:t>
-      </w:r>
-      <w:r>
-        <w:rPr>
-          <w:rStyle w:val="VariableTok"/>
-        </w:rPr>
-        <w:t>self</w:t>
-      </w:r>
-      <w:r>
-        <w:rPr>
-          <w:rStyle w:val="NormalTok"/>
-        </w:rPr>
-        <w:t xml:space="preserve">.area </w:t>
-      </w:r>
-      <w:r>
-        <w:rPr>
-          <w:rStyle w:val="OperatorTok"/>
-        </w:rPr>
-        <w:t>=</w:t>
-      </w:r>
-      <w:r>
-        <w:rPr>
-          <w:rStyle w:val="NormalTok"/>
-        </w:rPr>
-        <w:t xml:space="preserve"> ExperimentArea(</w:t>
-      </w:r>
-      <w:r>
-        <w:rPr>
-          <w:rStyle w:val="VariableTok"/>
-        </w:rPr>
-        <w:t>self</w:t>
-      </w:r>
-      <w:r>
-        <w:rPr>
-          <w:rStyle w:val="NormalTok"/>
-        </w:rPr>
-        <w:t>)</w:t>
-      </w:r>
-      <w:r>
-        <w:br/>
-      </w:r>
-      <w:r>
-        <w:rPr>
-          <w:rStyle w:val="NormalTok"/>
-        </w:rPr>
-        <w:t xml:space="preserve">    layout.addWidget(</w:t>
-      </w:r>
-      <w:r>
-        <w:rPr>
-          <w:rStyle w:val="VariableTok"/>
-        </w:rPr>
-        <w:t>self</w:t>
-      </w:r>
-      <w:r>
-        <w:rPr>
-          <w:rStyle w:val="NormalTok"/>
-        </w:rPr>
-        <w:t>.area, stretch</w:t>
-      </w:r>
-      <w:r>
-        <w:rPr>
-          <w:rStyle w:val="OperatorTok"/>
-        </w:rPr>
-        <w:t>=</w:t>
-      </w:r>
-      <w:r>
-        <w:rPr>
-          <w:rStyle w:val="DecValTok"/>
-        </w:rPr>
-        <w:t>1</w:t>
-      </w:r>
-      <w:r>
-        <w:rPr>
-          <w:rStyle w:val="NormalTok"/>
-        </w:rPr>
-        <w:t>)</w:t>
-      </w:r>
-      <w:r>
-        <w:br/>
-      </w:r>
-      <w:r>
-        <w:br/>
-      </w:r>
-      <w:r>
-        <w:rPr>
-          <w:rStyle w:val="NormalTok"/>
-        </w:rPr>
-        <w:t xml:space="preserve">    </w:t>
-      </w:r>
-      <w:r>
-        <w:rPr>
-          <w:rStyle w:val="VariableTok"/>
-        </w:rPr>
-        <w:t>self</w:t>
-      </w:r>
-      <w:r>
-        <w:rPr>
-          <w:rStyle w:val="NormalTok"/>
-        </w:rPr>
-        <w:t>.setLayout(layout)</w:t>
-      </w:r>
-    </w:p>
-    <w:p>
-      <w:pPr>
         <w:rPr>
           <w:rFonts w:asciiTheme="majorHAnsi" w:eastAsiaTheme="majorEastAsia" w:hAnsiTheme="majorHAnsi" w:cstheme="majorBidi"/>
           <w:b/>
           <w:bCs/>
           <w:color w:val="4F81BD" w:themeColor="accent1"/>
-          <w:lang w:val="fr-FR"/>
         </w:rPr>
       </w:pPr>
       <w:bookmarkStart w:id="17" w:name="analyse-statistique"/>
       <w:bookmarkEnd w:id="16"/>
-      <w:r>
-        <w:rPr>
-          <w:lang w:val="fr-FR"/>
-        </w:rPr>
-        <w:br w:type="page"/>
-      </w:r>
     </w:p>
     <w:p>
       <w:pPr>
@@ -3700,7 +3010,6 @@
         <w:rPr>
           <w:lang w:val="fr-FR"/>
         </w:rPr>
-        <w:lastRenderedPageBreak/>
         <w:t>Analyse statistique</w:t>
       </w:r>
     </w:p>
@@ -3762,16 +3071,8 @@
         <w:rPr>
           <w:lang w:val="fr-FR"/>
         </w:rPr>
-        <w:t xml:space="preserve">Les temps réels vs les temps prédits par la loi de </w:t>
-      </w:r>
-      <w:proofErr w:type="spellStart"/>
-      <w:r>
-        <w:rPr>
-          <w:lang w:val="fr-FR"/>
-        </w:rPr>
-        <w:t>Fitts</w:t>
-      </w:r>
-      <w:proofErr w:type="spellEnd"/>
+        <w:t>Les temps réels vs les temps prédits par la loi de Fitts</w:t>
+      </w:r>
     </w:p>
     <w:p>
       <w:pPr>
@@ -3836,605 +3137,6 @@
     </w:p>
     <w:p>
       <w:pPr>
-        <w:pStyle w:val="SourceCode"/>
-        <w:rPr>
-          <w:lang w:val="fr-FR"/>
-        </w:rPr>
-      </w:pPr>
-      <w:r>
-        <w:rPr>
-          <w:rStyle w:val="CommentTok"/>
-        </w:rPr>
-        <w:t xml:space="preserve"># Classe </w:t>
-      </w:r>
-      <w:proofErr w:type="spellStart"/>
-      <w:r>
-        <w:rPr>
-          <w:rStyle w:val="CommentTok"/>
-        </w:rPr>
-        <w:t>StatsScreen</w:t>
-      </w:r>
-      <w:proofErr w:type="spellEnd"/>
-      <w:r>
-        <w:br/>
-      </w:r>
-      <w:r>
-        <w:rPr>
-          <w:rStyle w:val="KeywordTok"/>
-        </w:rPr>
-        <w:t>def</w:t>
-      </w:r>
-      <w:r>
-        <w:rPr>
-          <w:rStyle w:val="NormalTok"/>
-        </w:rPr>
-        <w:t xml:space="preserve"> update_plot(</w:t>
-      </w:r>
-      <w:r>
-        <w:rPr>
-          <w:rStyle w:val="VariableTok"/>
-        </w:rPr>
-        <w:t>self</w:t>
-      </w:r>
-      <w:r>
-        <w:rPr>
-          <w:rStyle w:val="NormalTok"/>
-        </w:rPr>
-        <w:t xml:space="preserve">, </w:t>
-      </w:r>
-      <w:r>
-        <w:rPr>
-          <w:rStyle w:val="OperatorTok"/>
-        </w:rPr>
-        <w:t>*</w:t>
-      </w:r>
-      <w:r>
-        <w:rPr>
-          <w:rStyle w:val="NormalTok"/>
-        </w:rPr>
-        <w:t>_):</w:t>
-      </w:r>
-      <w:r>
-        <w:br/>
-      </w:r>
-      <w:r>
-        <w:rPr>
-          <w:rStyle w:val="NormalTok"/>
-        </w:rPr>
-        <w:t xml:space="preserve">    </w:t>
-      </w:r>
-      <w:r>
-        <w:rPr>
-          <w:rStyle w:val="CommentTok"/>
-        </w:rPr>
-        <w:t>"""</w:t>
-      </w:r>
-      <w:r>
-        <w:br/>
-      </w:r>
-      <w:r>
-        <w:rPr>
-          <w:rStyle w:val="CommentTok"/>
-        </w:rPr>
-        <w:t xml:space="preserve">    Update the plot based on the current x-axis selection.</w:t>
-      </w:r>
-      <w:r>
-        <w:br/>
-      </w:r>
-      <w:r>
-        <w:rPr>
-          <w:rStyle w:val="CommentTok"/>
-        </w:rPr>
-        <w:t xml:space="preserve">    Only shows regression line for Index of Difficulty view.</w:t>
-      </w:r>
-      <w:r>
-        <w:br/>
-      </w:r>
-      <w:r>
-        <w:rPr>
-          <w:rStyle w:val="CommentTok"/>
-        </w:rPr>
-        <w:t xml:space="preserve">    """</w:t>
-      </w:r>
-      <w:r>
-        <w:br/>
-      </w:r>
-      <w:r>
-        <w:rPr>
-          <w:rStyle w:val="NormalTok"/>
-        </w:rPr>
-        <w:t xml:space="preserve">    </w:t>
-      </w:r>
-      <w:r>
-        <w:rPr>
-          <w:rStyle w:val="VariableTok"/>
-        </w:rPr>
-        <w:t>self</w:t>
-      </w:r>
-      <w:r>
-        <w:rPr>
-          <w:rStyle w:val="NormalTok"/>
-        </w:rPr>
-        <w:t>.ax.clear()</w:t>
-      </w:r>
-      <w:r>
-        <w:br/>
-      </w:r>
-      <w:r>
-        <w:rPr>
-          <w:rStyle w:val="NormalTok"/>
-        </w:rPr>
-        <w:t xml:space="preserve">    </w:t>
-      </w:r>
-      <w:r>
-        <w:rPr>
-          <w:rStyle w:val="ControlFlowTok"/>
-        </w:rPr>
-        <w:t>if</w:t>
-      </w:r>
-      <w:r>
-        <w:rPr>
-          <w:rStyle w:val="NormalTok"/>
-        </w:rPr>
-        <w:t xml:space="preserve"> </w:t>
-      </w:r>
-      <w:r>
-        <w:rPr>
-          <w:rStyle w:val="KeywordTok"/>
-        </w:rPr>
-        <w:t>not</w:t>
-      </w:r>
-      <w:r>
-        <w:rPr>
-          <w:rStyle w:val="NormalTok"/>
-        </w:rPr>
-        <w:t xml:space="preserve"> </w:t>
-      </w:r>
-      <w:r>
-        <w:rPr>
-          <w:rStyle w:val="VariableTok"/>
-        </w:rPr>
-        <w:t>self</w:t>
-      </w:r>
-      <w:r>
-        <w:rPr>
-          <w:rStyle w:val="NormalTok"/>
-        </w:rPr>
-        <w:t>.data:</w:t>
-      </w:r>
-      <w:r>
-        <w:br/>
-      </w:r>
-      <w:r>
-        <w:rPr>
-          <w:rStyle w:val="NormalTok"/>
-        </w:rPr>
-        <w:t xml:space="preserve">        </w:t>
-      </w:r>
-      <w:r>
-        <w:rPr>
-          <w:rStyle w:val="ControlFlowTok"/>
-        </w:rPr>
-        <w:t>return</w:t>
-      </w:r>
-      <w:r>
-        <w:br/>
-      </w:r>
-      <w:r>
-        <w:br/>
-      </w:r>
-      <w:r>
-        <w:rPr>
-          <w:rStyle w:val="NormalTok"/>
-        </w:rPr>
-        <w:t xml:space="preserve">    x_axis_choice </w:t>
-      </w:r>
-      <w:r>
-        <w:rPr>
-          <w:rStyle w:val="OperatorTok"/>
-        </w:rPr>
-        <w:t>=</w:t>
-      </w:r>
-      <w:r>
-        <w:rPr>
-          <w:rStyle w:val="NormalTok"/>
-        </w:rPr>
-        <w:t xml:space="preserve"> </w:t>
-      </w:r>
-      <w:r>
-        <w:rPr>
-          <w:rStyle w:val="VariableTok"/>
-        </w:rPr>
-        <w:t>self</w:t>
-      </w:r>
-      <w:r>
-        <w:rPr>
-          <w:rStyle w:val="NormalTok"/>
-        </w:rPr>
-        <w:t>.x_axis_selector.currentText()</w:t>
-      </w:r>
-      <w:r>
-        <w:br/>
-      </w:r>
-      <w:r>
-        <w:br/>
-      </w:r>
-      <w:r>
-        <w:rPr>
-          <w:rStyle w:val="NormalTok"/>
-        </w:rPr>
-        <w:t xml:space="preserve">    </w:t>
-      </w:r>
-      <w:r>
-        <w:rPr>
-          <w:rStyle w:val="ControlFlowTok"/>
-        </w:rPr>
-        <w:t>if</w:t>
-      </w:r>
-      <w:r>
-        <w:rPr>
-          <w:rStyle w:val="NormalTok"/>
-        </w:rPr>
-        <w:t xml:space="preserve"> x_axis_choice </w:t>
-      </w:r>
-      <w:r>
-        <w:rPr>
-          <w:rStyle w:val="OperatorTok"/>
-        </w:rPr>
-        <w:t>==</w:t>
-      </w:r>
-      <w:r>
-        <w:rPr>
-          <w:rStyle w:val="NormalTok"/>
-        </w:rPr>
-        <w:t xml:space="preserve"> </w:t>
-      </w:r>
-      <w:r>
-        <w:rPr>
-          <w:rStyle w:val="StringTok"/>
-        </w:rPr>
-        <w:t>"Target Number"</w:t>
-      </w:r>
-      <w:r>
-        <w:rPr>
-          <w:rStyle w:val="NormalTok"/>
-        </w:rPr>
-        <w:t>:</w:t>
-      </w:r>
-      <w:r>
-        <w:br/>
-      </w:r>
-      <w:r>
-        <w:rPr>
-          <w:rStyle w:val="NormalTok"/>
-        </w:rPr>
-        <w:t xml:space="preserve">        x_data </w:t>
-      </w:r>
-      <w:r>
-        <w:rPr>
-          <w:rStyle w:val="OperatorTok"/>
-        </w:rPr>
-        <w:t>=</w:t>
-      </w:r>
-      <w:r>
-        <w:rPr>
-          <w:rStyle w:val="NormalTok"/>
-        </w:rPr>
-        <w:t xml:space="preserve"> [d[</w:t>
-      </w:r>
-      <w:r>
-        <w:rPr>
-          <w:rStyle w:val="StringTok"/>
-        </w:rPr>
-        <w:t>'target_index'</w:t>
-      </w:r>
-      <w:r>
-        <w:rPr>
-          <w:rStyle w:val="NormalTok"/>
-        </w:rPr>
-        <w:t xml:space="preserve">] </w:t>
-      </w:r>
-      <w:r>
-        <w:rPr>
-          <w:rStyle w:val="ControlFlowTok"/>
-        </w:rPr>
-        <w:t>for</w:t>
-      </w:r>
-      <w:r>
-        <w:rPr>
-          <w:rStyle w:val="NormalTok"/>
-        </w:rPr>
-        <w:t xml:space="preserve"> d </w:t>
-      </w:r>
-      <w:r>
-        <w:rPr>
-          <w:rStyle w:val="KeywordTok"/>
-        </w:rPr>
-        <w:t>in</w:t>
-      </w:r>
-      <w:r>
-        <w:rPr>
-          <w:rStyle w:val="NormalTok"/>
-        </w:rPr>
-        <w:t xml:space="preserve"> </w:t>
-      </w:r>
-      <w:r>
-        <w:rPr>
-          <w:rStyle w:val="VariableTok"/>
-        </w:rPr>
-        <w:t>self</w:t>
-      </w:r>
-      <w:r>
-        <w:rPr>
-          <w:rStyle w:val="NormalTok"/>
-        </w:rPr>
-        <w:t>.data]</w:t>
-      </w:r>
-      <w:r>
-        <w:br/>
-      </w:r>
-      <w:r>
-        <w:rPr>
-          <w:rStyle w:val="NormalTok"/>
-        </w:rPr>
-        <w:t xml:space="preserve">        x_label </w:t>
-      </w:r>
-      <w:r>
-        <w:rPr>
-          <w:rStyle w:val="OperatorTok"/>
-        </w:rPr>
-        <w:t>=</w:t>
-      </w:r>
-      <w:r>
-        <w:rPr>
-          <w:rStyle w:val="NormalTok"/>
-        </w:rPr>
-        <w:t xml:space="preserve"> </w:t>
-      </w:r>
-      <w:r>
-        <w:rPr>
-          <w:rStyle w:val="StringTok"/>
-        </w:rPr>
-        <w:t>"Target Number"</w:t>
-      </w:r>
-      <w:r>
-        <w:br/>
-      </w:r>
-      <w:r>
-        <w:rPr>
-          <w:rStyle w:val="NormalTok"/>
-        </w:rPr>
-        <w:t xml:space="preserve">        </w:t>
-      </w:r>
-      <w:r>
-        <w:rPr>
-          <w:rStyle w:val="CommentTok"/>
-        </w:rPr>
-        <w:t># Connected points for time series views</w:t>
-      </w:r>
-      <w:r>
-        <w:br/>
-      </w:r>
-      <w:r>
-        <w:rPr>
-          <w:rStyle w:val="NormalTok"/>
-        </w:rPr>
-        <w:t xml:space="preserve">        </w:t>
-      </w:r>
-      <w:r>
-        <w:rPr>
-          <w:rStyle w:val="VariableTok"/>
-        </w:rPr>
-        <w:t>self</w:t>
-      </w:r>
-      <w:r>
-        <w:rPr>
-          <w:rStyle w:val="NormalTok"/>
-        </w:rPr>
-        <w:t>.ax.plot(x_data, [d[</w:t>
-      </w:r>
-      <w:r>
-        <w:rPr>
-          <w:rStyle w:val="StringTok"/>
-        </w:rPr>
-        <w:t>'actual_time'</w:t>
-      </w:r>
-      <w:r>
-        <w:rPr>
-          <w:rStyle w:val="NormalTok"/>
-        </w:rPr>
-        <w:t xml:space="preserve">] </w:t>
-      </w:r>
-      <w:r>
-        <w:rPr>
-          <w:rStyle w:val="ControlFlowTok"/>
-        </w:rPr>
-        <w:t>for</w:t>
-      </w:r>
-      <w:r>
-        <w:rPr>
-          <w:rStyle w:val="NormalTok"/>
-        </w:rPr>
-        <w:t xml:space="preserve"> d </w:t>
-      </w:r>
-      <w:r>
-        <w:rPr>
-          <w:rStyle w:val="KeywordTok"/>
-        </w:rPr>
-        <w:t>in</w:t>
-      </w:r>
-      <w:r>
-        <w:rPr>
-          <w:rStyle w:val="NormalTok"/>
-        </w:rPr>
-        <w:t xml:space="preserve"> </w:t>
-      </w:r>
-      <w:r>
-        <w:rPr>
-          <w:rStyle w:val="VariableTok"/>
-        </w:rPr>
-        <w:t>self</w:t>
-      </w:r>
-      <w:r>
-        <w:rPr>
-          <w:rStyle w:val="NormalTok"/>
-        </w:rPr>
-        <w:t xml:space="preserve">.data], </w:t>
-      </w:r>
-      <w:r>
-        <w:rPr>
-          <w:rStyle w:val="StringTok"/>
-        </w:rPr>
-        <w:t>'o-'</w:t>
-      </w:r>
-      <w:r>
-        <w:rPr>
-          <w:rStyle w:val="NormalTok"/>
-        </w:rPr>
-        <w:t>, label</w:t>
-      </w:r>
-      <w:r>
-        <w:rPr>
-          <w:rStyle w:val="OperatorTok"/>
-        </w:rPr>
-        <w:t>=</w:t>
-      </w:r>
-      <w:r>
-        <w:rPr>
-          <w:rStyle w:val="StringTok"/>
-        </w:rPr>
-        <w:t>"Actual Times"</w:t>
-      </w:r>
-      <w:r>
-        <w:rPr>
-          <w:rStyle w:val="NormalTok"/>
-        </w:rPr>
-        <w:t>)</w:t>
-      </w:r>
-      <w:r>
-        <w:br/>
-      </w:r>
-      <w:r>
-        <w:rPr>
-          <w:rStyle w:val="NormalTok"/>
-        </w:rPr>
-        <w:t xml:space="preserve">        </w:t>
-      </w:r>
-      <w:r>
-        <w:rPr>
-          <w:rStyle w:val="VariableTok"/>
-        </w:rPr>
-        <w:t>self</w:t>
-      </w:r>
-      <w:r>
-        <w:rPr>
-          <w:rStyle w:val="NormalTok"/>
-        </w:rPr>
-        <w:t>.ax.plot(x_data, [d[</w:t>
-      </w:r>
-      <w:r>
-        <w:rPr>
-          <w:rStyle w:val="StringTok"/>
-        </w:rPr>
-        <w:t>'expected_time'</w:t>
-      </w:r>
-      <w:r>
-        <w:rPr>
-          <w:rStyle w:val="NormalTok"/>
-        </w:rPr>
-        <w:t xml:space="preserve">] </w:t>
-      </w:r>
-      <w:r>
-        <w:rPr>
-          <w:rStyle w:val="ControlFlowTok"/>
-        </w:rPr>
-        <w:t>for</w:t>
-      </w:r>
-      <w:r>
-        <w:rPr>
-          <w:rStyle w:val="NormalTok"/>
-        </w:rPr>
-        <w:t xml:space="preserve"> d </w:t>
-      </w:r>
-      <w:r>
-        <w:rPr>
-          <w:rStyle w:val="KeywordTok"/>
-        </w:rPr>
-        <w:t>in</w:t>
-      </w:r>
-      <w:r>
-        <w:rPr>
-          <w:rStyle w:val="NormalTok"/>
-        </w:rPr>
-        <w:t xml:space="preserve"> </w:t>
-      </w:r>
-      <w:r>
-        <w:rPr>
-          <w:rStyle w:val="VariableTok"/>
-        </w:rPr>
-        <w:t>self</w:t>
-      </w:r>
-      <w:r>
-        <w:rPr>
-          <w:rStyle w:val="NormalTok"/>
-        </w:rPr>
-        <w:t xml:space="preserve">.data], </w:t>
-      </w:r>
-      <w:r>
-        <w:rPr>
-          <w:rStyle w:val="StringTok"/>
-        </w:rPr>
-        <w:t>'s--'</w:t>
-      </w:r>
-      <w:r>
-        <w:rPr>
-          <w:rStyle w:val="NormalTok"/>
-        </w:rPr>
-        <w:t>, label</w:t>
-      </w:r>
-      <w:r>
-        <w:rPr>
-          <w:rStyle w:val="OperatorTok"/>
-        </w:rPr>
-        <w:t>=</w:t>
-      </w:r>
-      <w:r>
-        <w:rPr>
-          <w:rStyle w:val="StringTok"/>
-        </w:rPr>
-        <w:t>"Expected Times"</w:t>
-      </w:r>
-      <w:r>
-        <w:rPr>
-          <w:rStyle w:val="NormalTok"/>
-        </w:rPr>
-        <w:t>)</w:t>
-      </w:r>
-      <w:r>
-        <w:br/>
-      </w:r>
-      <w:r>
-        <w:rPr>
-          <w:rStyle w:val="NormalTok"/>
-        </w:rPr>
-        <w:t xml:space="preserve">    </w:t>
-      </w:r>
-      <w:r>
-        <w:rPr>
-          <w:rStyle w:val="CommentTok"/>
-        </w:rPr>
-        <w:t xml:space="preserve"># ... </w:t>
-      </w:r>
-      <w:r>
-        <w:rPr>
-          <w:rStyle w:val="CommentTok"/>
-          <w:lang w:val="fr-FR"/>
-        </w:rPr>
-        <w:t>(autres types de visualisations)</w:t>
-      </w:r>
-    </w:p>
-    <w:p>
-      <w:pPr>
         <w:rPr>
           <w:rFonts w:asciiTheme="majorHAnsi" w:eastAsiaTheme="majorEastAsia" w:hAnsiTheme="majorHAnsi" w:cstheme="majorBidi"/>
           <w:b/>
@@ -4478,21 +3180,7 @@
         <w:rPr>
           <w:lang w:val="fr-FR"/>
         </w:rPr>
-        <w:t xml:space="preserve">Une fonctionnalité clé de l'application est la possibilité d'ajuster dynamiquement les paramètres a et b de la loi de </w:t>
-      </w:r>
-      <w:proofErr w:type="spellStart"/>
-      <w:r>
-        <w:rPr>
-          <w:lang w:val="fr-FR"/>
-        </w:rPr>
-        <w:t>Fitts</w:t>
-      </w:r>
-      <w:proofErr w:type="spellEnd"/>
-      <w:r>
-        <w:rPr>
-          <w:lang w:val="fr-FR"/>
-        </w:rPr>
-        <w:t>, et de voir immédiatement l'impact sur les graphiques. Cela permet à l'utilisateur de trouver les valeurs qui correspondent le mieux aux données expérimentales.</w:t>
+        <w:t>Une fonctionnalité clé de l'application est la possibilité d'ajuster dynamiquement les paramètres a et b de la loi de Fitts, et de voir immédiatement l'impact sur les graphiques. Cela permet à l'utilisateur de trouver les valeurs qui correspondent le mieux aux données expérimentales.</w:t>
       </w:r>
     </w:p>
     <w:p>
@@ -4517,8 +3205,16 @@
         <w:rPr>
           <w:rStyle w:val="CommentTok"/>
         </w:rPr>
-        <w:t xml:space="preserve"> SettingsScreen</w:t>
-      </w:r>
+        <w:t xml:space="preserve"> </w:t>
+      </w:r>
+      <w:proofErr w:type="spellStart"/>
+      <w:r>
+        <w:rPr>
+          <w:rStyle w:val="CommentTok"/>
+        </w:rPr>
+        <w:t>SettingsScreen</w:t>
+      </w:r>
+      <w:proofErr w:type="spellEnd"/>
       <w:r>
         <w:br/>
       </w:r>
@@ -4532,7 +3228,21 @@
         <w:rPr>
           <w:rStyle w:val="NormalTok"/>
         </w:rPr>
-        <w:t xml:space="preserve"> apply_coefficients(</w:t>
+        <w:t xml:space="preserve"> </w:t>
+      </w:r>
+      <w:proofErr w:type="spellStart"/>
+      <w:r>
+        <w:rPr>
+          <w:rStyle w:val="NormalTok"/>
+        </w:rPr>
+        <w:t>apply_coefficients</w:t>
+      </w:r>
+      <w:proofErr w:type="spellEnd"/>
+      <w:r>
+        <w:rPr>
+          <w:rStyle w:val="NormalTok"/>
+        </w:rPr>
+        <w:t>(</w:t>
       </w:r>
       <w:r>
         <w:rPr>
@@ -5075,16 +3785,12 @@
           <w:color w:val="4F81BD" w:themeColor="accent1"/>
           <w:sz w:val="28"/>
           <w:szCs w:val="28"/>
-          <w:lang w:val="fr-FR"/>
         </w:rPr>
       </w:pPr>
       <w:bookmarkStart w:id="19" w:name="X74cd94cd68654084753eb14faee8dd26be1b6b2"/>
       <w:bookmarkEnd w:id="14"/>
       <w:bookmarkEnd w:id="18"/>
       <w:r>
-        <w:rPr>
-          <w:lang w:val="fr-FR"/>
-        </w:rPr>
         <w:br w:type="page"/>
       </w:r>
     </w:p>
@@ -7569,8 +6275,13 @@
       </w:r>
       <w:proofErr w:type="spellEnd"/>
       <w:r>
-        <w:t xml:space="preserve"> de la mémoire</w:t>
-      </w:r>
+        <w:t xml:space="preserve"> de la </w:t>
+      </w:r>
+      <w:proofErr w:type="spellStart"/>
+      <w:r>
+        <w:t>mémoire</w:t>
+      </w:r>
+      <w:proofErr w:type="spellEnd"/>
     </w:p>
     <w:p>
       <w:pPr>
@@ -8579,6 +7290,7 @@
       <w:r>
         <w:br/>
       </w:r>
+      <w:proofErr w:type="spellStart"/>
       <w:proofErr w:type="gramStart"/>
       <w:r>
         <w:rPr>
@@ -8604,14 +7316,29 @@
         <w:rPr>
           <w:rStyle w:val="NormalTok"/>
         </w:rPr>
-        <w:t>setSizePolicy(</w:t>
-      </w:r>
+        <w:t>setSizePolicy</w:t>
+      </w:r>
+      <w:proofErr w:type="spellEnd"/>
+      <w:r>
+        <w:rPr>
+          <w:rStyle w:val="NormalTok"/>
+        </w:rPr>
+        <w:t>(</w:t>
+      </w:r>
+      <w:proofErr w:type="spellStart"/>
       <w:proofErr w:type="gramEnd"/>
       <w:r>
         <w:rPr>
           <w:rStyle w:val="NormalTok"/>
         </w:rPr>
-        <w:t>QSizePolicy.Expanding, QSizePolicy.Expanding)</w:t>
+        <w:t>QSizePolicy.Expanding</w:t>
+      </w:r>
+      <w:proofErr w:type="spellEnd"/>
+      <w:r>
+        <w:rPr>
+          <w:rStyle w:val="NormalTok"/>
+        </w:rPr>
+        <w:t>, QSizePolicy.Expanding)</w:t>
       </w:r>
       <w:r>
         <w:br/>
@@ -8678,16 +7405,12 @@
           <w:color w:val="4F81BD" w:themeColor="accent1"/>
           <w:sz w:val="28"/>
           <w:szCs w:val="28"/>
-          <w:lang w:val="fr-FR"/>
         </w:rPr>
       </w:pPr>
       <w:bookmarkStart w:id="28" w:name="Xa5355a7fcaa324d1a07e34fae81851e068ee41e"/>
       <w:bookmarkEnd w:id="25"/>
       <w:bookmarkEnd w:id="27"/>
       <w:r>
-        <w:rPr>
-          <w:lang w:val="fr-FR"/>
-        </w:rPr>
         <w:br w:type="page"/>
       </w:r>
     </w:p>
@@ -9062,21 +7785,7 @@
         <w:rPr>
           <w:lang w:val="fr-FR"/>
         </w:rPr>
-        <w:t xml:space="preserve">Ce projet m'a permis de mettre en pratique les concepts théoriques vus en cours sur l'interaction homme-machine, notamment la loi de </w:t>
-      </w:r>
-      <w:proofErr w:type="spellStart"/>
-      <w:r>
-        <w:rPr>
-          <w:lang w:val="fr-FR"/>
-        </w:rPr>
-        <w:t>Fitts</w:t>
-      </w:r>
-      <w:proofErr w:type="spellEnd"/>
-      <w:r>
-        <w:rPr>
-          <w:lang w:val="fr-FR"/>
-        </w:rPr>
-        <w:t xml:space="preserve"> et le modèle GOMS/</w:t>
+        <w:t>Ce projet m'a permis de mettre en pratique les concepts théoriques vus en cours sur l'interaction homme-machine, notamment la loi de Fitts et le modèle GOMS/</w:t>
       </w:r>
       <w:proofErr w:type="spellStart"/>
       <w:r>

</xml_diff>